<commit_message>
Update portfolio content and analytics
</commit_message>
<xml_diff>
--- a/public/Medvedskiy_Pavlo_Resume.docx
+++ b/public/Medvedskiy_Pavlo_Resume.docx
@@ -83,7 +83,7 @@
           <w:color w:val="0F172A"/>
           <w:sz w:val="17"/>
         </w:rPr>
-        <w:t>Senior Quality Assurance Engineer with 8+ years of commercial experience in desktop, web, API, database, and real-time systems testing. Experienced in functional, integration, regression, exploratory, smoke, release, and system testing. Strong background in requirements analysis, test design, SQL, API validation, databases, network protocols, Electron applications, Docker, Linux, and cross-platform validation. Comfortable investigating defects through logs, data state, client-server behavior, and business logic, with mentoring and knowledge-sharing experience.</w:t>
+        <w:t>Senior Quality Assurance Engineer with 8+ years of commercial experience in desktop, web, API, database, and real-time systems testing. Strong background in requirements analysis, test design, SQL, API validation, network protocols, Electron applications, Docker, Linux, and cross-platform validation. Experienced in evidence-based defect investigation using logs, data state, client-server behavior, and business logic, with mentoring and knowledge-sharing experience.</w:t>
       </w:r>
     </w:p>
     <w:p>
@@ -130,6 +130,11 @@
       </w:r>
     </w:p>
     <w:p>
+      <w:r>
+        <w:t>Technical QA: Requirements Analysis, Test Design, API Testing, SQL, Database Validation, Defect Investigation, Client-server Validation, Real-time Log Analysis</w:t>
+      </w:r>
+    </w:p>
+    <w:p>
       <w:pPr>
         <w:spacing w:after="36" w:line="247" w:lineRule="auto"/>
       </w:pPr>
@@ -141,7 +146,7 @@
           <w:color w:val="0F172A"/>
           <w:sz w:val="17"/>
         </w:rPr>
-        <w:t xml:space="preserve">Technical QA: </w:t>
+        <w:t>Protocol / Integration Exposure: ArduPilot, MAVLink, real-time logs, controlled environment behavior, Electron state/store validation</w:t>
       </w:r>
       <w:r>
         <w:rPr>
@@ -151,7 +156,6 @@
           <w:color w:val="0F172A"/>
           <w:sz w:val="17"/>
         </w:rPr>
-        <w:t>Requirements Analysis, Test Design, API Testing, SQL, Database Validation, Log Analysis, Defect Investigation, Client-server Validation</w:t>
       </w:r>
     </w:p>
     <w:p>
@@ -216,7 +220,7 @@
           <w:color w:val="0F172A"/>
           <w:sz w:val="17"/>
         </w:rPr>
-        <w:t xml:space="preserve">Automation Exposure: </w:t>
+        <w:t>Automation Exposure: Java, Rest Assured, TestNG, Postman runners</w:t>
       </w:r>
       <w:r>
         <w:rPr>
@@ -226,7 +230,6 @@
           <w:color w:val="0F172A"/>
           <w:sz w:val="17"/>
         </w:rPr>
-        <w:t>Java, Rest Assured, TestNG, Postman runners, Selenide/Selenium basics</w:t>
       </w:r>
     </w:p>
     <w:p>
@@ -319,7 +322,7 @@
           <w:color w:val="475569"/>
           <w:sz w:val="17"/>
         </w:rPr>
-        <w:t>Confidential NDA desktop platform - large-scale Electron application with cross-platform delivery.</w:t>
+        <w:t>Multi-project CODY experience across a confidential NDA MilTech desktop platform, mobile/API products, and web/API platforms.</w:t>
       </w:r>
     </w:p>
     <w:p>
@@ -336,7 +339,7 @@
           <w:color w:val="0F172A"/>
           <w:sz w:val="17"/>
         </w:rPr>
-        <w:t>Currently working on a technically complex Electron desktop application under NDA, with validation across Ubuntu, Windows, and macOS.</w:t>
+        <w:t>Validate a technically complex MilTech Electron desktop application under NDA, covering real-time workflows, integrations, and cross-platform behavior across Ubuntu, Windows, and macOS.</w:t>
       </w:r>
     </w:p>
     <w:p>
@@ -353,7 +356,7 @@
           <w:color w:val="0F172A"/>
           <w:sz w:val="17"/>
         </w:rPr>
-        <w:t>Own functional, integration, regression, exploratory, system, and release validation activities for desktop and connected backend functionality.</w:t>
+        <w:t>Created and maintained a 1,209-case TestRail suite, with all test cases mapped to requirements through a traceability matrix.</w:t>
       </w:r>
     </w:p>
     <w:p>
@@ -370,7 +373,7 @@
           <w:color w:val="0F172A"/>
           <w:sz w:val="17"/>
         </w:rPr>
-        <w:t>Analyze requirements, clarify edge cases, design test coverage, and validate business logic across client-server workflows.</w:t>
+        <w:t>Covered three CODY projects - Blai, JMES World, and SupaBox - across mobile, web, API, and integration-heavy workflows, plus NDA-protected desktop delivery.</w:t>
       </w:r>
     </w:p>
     <w:p>
@@ -387,7 +390,7 @@
           <w:color w:val="0F172A"/>
           <w:sz w:val="17"/>
         </w:rPr>
-        <w:t>Investigate defects using logs, API responses, database state, simulator behavior, and environment-specific reproduction steps.</w:t>
+        <w:t>Analyze requirements, clarify edge cases, design risk-based regression coverage, and investigate defects using real-time logs, API responses, database state, Electron state/store behavior, controlled environment behavior, and telemetry-style evidence.</w:t>
       </w:r>
     </w:p>
     <w:p>
@@ -404,24 +407,7 @@
           <w:color w:val="0F172A"/>
           <w:sz w:val="17"/>
         </w:rPr>
-        <w:t>Perform API and database validation, including SQL checks and integration verification across backend and desktop layers.</w:t>
-      </w:r>
-    </w:p>
-    <w:p>
-      <w:pPr>
-        <w:pStyle w:val="ListBullet"/>
-        <w:spacing w:after="34" w:line="247" w:lineRule="auto"/>
-        <w:ind w:left="317" w:hanging="173"/>
-      </w:pPr>
-      <w:r>
-        <w:rPr>
-          <w:rFonts w:ascii="Arial" w:hAnsi="Arial" w:eastAsia="Arial"/>
-          <w:b w:val="0"/>
-          <w:i w:val="0"/>
-          <w:color w:val="0F172A"/>
-          <w:sz w:val="17"/>
-        </w:rPr>
-        <w:t>Support QA documentation, test reporting, regression planning, onboarding, mentoring, and knowledge sharing within Agile delivery.</w:t>
+        <w:t>Support defect reporting, release validation, QA documentation, onboarding, mentoring, and knowledge sharing within Agile delivery.</w:t>
       </w:r>
     </w:p>
     <w:p>
@@ -1039,7 +1025,7 @@
                 <w:color w:val="0891B2"/>
                 <w:sz w:val="17"/>
               </w:rPr>
-              <w:t>Confidential Enterprise Desktop Platform</w:t>
+              <w:t>CODY Multi-project Exposure</w:t>
             </w:r>
           </w:p>
           <w:p>
@@ -1056,7 +1042,7 @@
                 <w:color w:val="0F172A"/>
                 <w:sz w:val="16"/>
               </w:rPr>
-              <w:t>Electron desktop QA</w:t>
+              <w:t>Confidential MilTech desktop QA</w:t>
             </w:r>
           </w:p>
           <w:p>
@@ -1073,7 +1059,7 @@
                 <w:color w:val="0F172A"/>
                 <w:sz w:val="16"/>
               </w:rPr>
-              <w:t>Ubuntu / Windows / macOS</w:t>
+              <w:t>ArduPilot / MAVLink context</w:t>
             </w:r>
           </w:p>
           <w:p>
@@ -1090,7 +1076,7 @@
                 <w:color w:val="0F172A"/>
                 <w:sz w:val="16"/>
               </w:rPr>
-              <w:t>Simulator testing</w:t>
+              <w:t>Real-time logs and integrations</w:t>
             </w:r>
           </w:p>
           <w:p>
@@ -1107,7 +1093,7 @@
                 <w:color w:val="0F172A"/>
                 <w:sz w:val="16"/>
               </w:rPr>
-              <w:t>Release validation</w:t>
+              <w:t>Electron state/store validation</w:t>
             </w:r>
           </w:p>
           <w:p>
@@ -1124,7 +1110,52 @@
                 <w:color w:val="0F172A"/>
                 <w:sz w:val="16"/>
               </w:rPr>
-              <w:t>API, DB, logs, and integration checks</w:t>
+              <w:t>Monolith-to-microservices validation</w:t>
+            </w:r>
+          </w:p>
+          <w:p>
+            <w:pPr>
+              <w:pStyle w:val="ListBullet"/>
+              <w:spacing w:after="24"/>
+              <w:ind w:left="259" w:hanging="144"/>
+            </w:pPr>
+            <w:r>
+              <w:rPr>
+                <w:rFonts w:ascii="Arial" w:hAnsi="Arial" w:eastAsia="Arial"/>
+                <w:b w:val="0"/>
+                <w:i w:val="0"/>
+                <w:color w:val="0F172A"/>
+                <w:sz w:val="16"/>
+              </w:rPr>
+              <w:t>Blai / JMES World / SupaBox QA</w:t>
+            </w:r>
+          </w:p>
+          <w:p>
+            <w:pPr>
+              <w:pStyle w:val="ListBullet"/>
+              <w:spacing w:after="24"/>
+              <w:ind w:left="259" w:hanging="144"/>
+            </w:pPr>
+            <w:r>
+              <w:rPr>
+                <w:rFonts w:ascii="Arial" w:hAnsi="Arial"/>
+                <w:color w:val="0F172A"/>
+                <w:sz w:val="16"/>
+              </w:rPr>
+            </w:r>
+          </w:p>
+          <w:p>
+            <w:pPr>
+              <w:pStyle w:val="ListBullet"/>
+              <w:spacing w:after="24"/>
+              <w:ind w:left="259" w:hanging="144"/>
+            </w:pPr>
+            <w:r>
+              <w:rPr>
+                <w:rFonts w:ascii="Arial" w:hAnsi="Arial"/>
+                <w:color w:val="0F172A"/>
+                <w:sz w:val="16"/>
+              </w:rPr>
             </w:r>
           </w:p>
         </w:tc>

</xml_diff>